<commit_message>
feat: added readMe file
</commit_message>
<xml_diff>
--- a/Group report .docx
+++ b/Group report .docx
@@ -5,7 +5,13 @@
     <w:sdt>
       <w:sdtPr>
         <w:rPr>
+          <w:rFonts w:eastAsiaTheme="minorHAnsi"/>
           <w:color w:val="156082" w:themeColor="accent1"/>
+          <w:kern w:val="2"/>
+          <w:sz w:val="24"/>
+          <w:szCs w:val="24"/>
+          <w:lang w:val="en-GB"/>
+          <w14:ligatures w14:val="standardContextual"/>
         </w:rPr>
         <w:id w:val="-249128159"/>
         <w:docPartObj>
@@ -15,15 +21,11 @@
       </w:sdtPr>
       <w:sdtEndPr>
         <w:rPr>
-          <w:rFonts w:eastAsiaTheme="minorHAnsi"/>
           <w:b/>
           <w:bCs/>
           <w:color w:val="auto"/>
-          <w:kern w:val="2"/>
           <w:sz w:val="40"/>
           <w:szCs w:val="40"/>
-          <w:lang w:val="en-GB"/>
-          <w14:ligatures w14:val="standardContextual"/>
         </w:rPr>
       </w:sdtEndPr>
       <w:sdtContent>
@@ -193,7 +195,7 @@
                   <w:sz w:val="28"/>
                   <w:szCs w:val="28"/>
                 </w:rPr>
-                <w:t xml:space="preserve"> 3 </w:t>
+                <w:t xml:space="preserve"> 3</w:t>
               </w:r>
             </w:p>
           </w:sdtContent>
@@ -395,7 +397,6 @@
                                   </w:rPr>
                                   <w:t xml:space="preserve">Dharma </w:t>
                                 </w:r>
-                                <w:proofErr w:type="spellStart"/>
                                 <w:r>
                                   <w:rPr>
                                     <w:b/>
@@ -404,9 +405,8 @@
                                     <w:sz w:val="28"/>
                                     <w:szCs w:val="28"/>
                                   </w:rPr>
-                                  <w:t>Budathoki</w:t>
+                                  <w:t xml:space="preserve">Bahadur Budhathoki </w:t>
                                 </w:r>
-                                <w:proofErr w:type="spellEnd"/>
                                 <w:r>
                                   <w:rPr>
                                     <w:b/>
@@ -415,7 +415,7 @@
                                     <w:sz w:val="28"/>
                                     <w:szCs w:val="28"/>
                                   </w:rPr>
-                                  <w:t xml:space="preserve"> (</w:t>
+                                  <w:t>(</w:t>
                                 </w:r>
                                 <w:r>
                                   <w:rPr>
@@ -472,7 +472,7 @@
                                     <w:sz w:val="28"/>
                                     <w:szCs w:val="28"/>
                                   </w:rPr>
-                                  <w:t xml:space="preserve"> Ala</w:t>
+                                  <w:t xml:space="preserve"> Bin Alam</w:t>
                                 </w:r>
                                 <w:r>
                                   <w:rPr>
@@ -482,7 +482,7 @@
                                     <w:sz w:val="28"/>
                                     <w:szCs w:val="28"/>
                                   </w:rPr>
-                                  <w:t>m (</w:t>
+                                  <w:t xml:space="preserve"> (</w:t>
                                 </w:r>
                                 <w:r>
                                   <w:rPr>
@@ -672,7 +672,6 @@
                             </w:rPr>
                             <w:t xml:space="preserve">Dharma </w:t>
                           </w:r>
-                          <w:proofErr w:type="spellStart"/>
                           <w:r>
                             <w:rPr>
                               <w:b/>
@@ -681,9 +680,8 @@
                               <w:sz w:val="28"/>
                               <w:szCs w:val="28"/>
                             </w:rPr>
-                            <w:t>Budathoki</w:t>
+                            <w:t xml:space="preserve">Bahadur Budhathoki </w:t>
                           </w:r>
-                          <w:proofErr w:type="spellEnd"/>
                           <w:r>
                             <w:rPr>
                               <w:b/>
@@ -692,7 +690,7 @@
                               <w:sz w:val="28"/>
                               <w:szCs w:val="28"/>
                             </w:rPr>
-                            <w:t xml:space="preserve"> (</w:t>
+                            <w:t>(</w:t>
                           </w:r>
                           <w:r>
                             <w:rPr>
@@ -749,7 +747,7 @@
                               <w:sz w:val="28"/>
                               <w:szCs w:val="28"/>
                             </w:rPr>
-                            <w:t xml:space="preserve"> Ala</w:t>
+                            <w:t xml:space="preserve"> Bin Alam</w:t>
                           </w:r>
                           <w:r>
                             <w:rPr>
@@ -759,7 +757,7 @@
                               <w:sz w:val="28"/>
                               <w:szCs w:val="28"/>
                             </w:rPr>
-                            <w:t>m (</w:t>
+                            <w:t xml:space="preserve"> (</w:t>
                           </w:r>
                           <w:r>
                             <w:rPr>
@@ -886,8 +884,13 @@
     <w:sdt>
       <w:sdtPr>
         <w:rPr>
+          <w:rFonts w:asciiTheme="minorHAnsi" w:eastAsiaTheme="minorHAnsi" w:hAnsiTheme="minorHAnsi" w:cstheme="minorBidi"/>
+          <w:color w:val="auto"/>
+          <w:kern w:val="2"/>
           <w:sz w:val="28"/>
           <w:szCs w:val="28"/>
+          <w:lang w:val="en-GB"/>
+          <w14:ligatures w14:val="standardContextual"/>
         </w:rPr>
         <w:id w:val="603764967"/>
         <w:docPartObj>
@@ -897,16 +900,11 @@
       </w:sdtPr>
       <w:sdtEndPr>
         <w:rPr>
-          <w:rFonts w:asciiTheme="minorHAnsi" w:eastAsiaTheme="minorHAnsi" w:hAnsiTheme="minorHAnsi" w:cstheme="minorBidi"/>
           <w:b/>
           <w:bCs/>
           <w:noProof/>
-          <w:color w:val="auto"/>
-          <w:kern w:val="2"/>
           <w:sz w:val="24"/>
           <w:szCs w:val="24"/>
-          <w:lang w:val="en-GB"/>
-          <w14:ligatures w14:val="standardContextual"/>
         </w:rPr>
       </w:sdtEndPr>
       <w:sdtContent>
@@ -5376,6 +5374,7 @@
       </w:pPr>
       <w:r>
         <w:rPr>
+          <w:noProof/>
           <w:lang w:val="en-US"/>
         </w:rPr>
         <w:drawing>
@@ -11046,6 +11045,7 @@
   <w:style w:type="character" w:default="1" w:styleId="DefaultParagraphFont">
     <w:name w:val="Default Paragraph Font"/>
     <w:uiPriority w:val="1"/>
+    <w:semiHidden/>
     <w:unhideWhenUsed/>
   </w:style>
   <w:style w:type="table" w:default="1" w:styleId="TableNormal">
@@ -11721,9 +11721,12 @@
   </w:compat>
   <w:rsids>
     <w:rsidRoot w:val="0041075A"/>
+    <w:rsid w:val="000A6F53"/>
     <w:rsid w:val="000D2F3E"/>
+    <w:rsid w:val="003857B1"/>
     <w:rsid w:val="0041075A"/>
     <w:rsid w:val="009766C2"/>
+    <w:rsid w:val="00B83F8C"/>
   </w:rsids>
   <m:mathPr>
     <m:mathFont m:val="Cambria Math"/>

</xml_diff>